<commit_message>
Add paper writing guide, post-run script and committed result tables
docs/PAPER_GUIDE.md: status by section, source file for every number,
timeline and human-validation checks. scripts/post_run.sh runs every
step from the finished scoring run to the paper tables. Result tables
(estimates only) for the pilot and the O*NET-transferred wage models are
now tracked; mock, synthetic and row-level outputs stay ignored. Draft
describes the 200-occupation validation sample.

Co-Authored-By: Claude Opus 5.5 <noreply@anthropic.com>
</commit_message>
<xml_diff>
--- a/paper/DTI_paper_draft.docx
+++ b/paper/DTI_paper_draft.docx
@@ -110,7 +110,23 @@
           <w:sz w:val="21"/>
           <w:szCs w:val="21"/>
         </w:rPr>
-        <w:t xml:space="preserve">) needs a new round of coding: the three forms received were not usable (identical scores on all five dimensions for every occupation). All numbers come from generated result files; none are typed by hand. Results tables: </w:t>
+        <w:t xml:space="preserve">): the three forms received first were not usable (identical scores on all five dimensions for every occupation), so a new round on a stratified sample of 200 occupations went to three coders on 20 October, due 21 October. A writing guide for co-authors (what is final, what is pending, which file each number comes from) is in </w:t>
+      </w:r>
+      <w:r>
+        <w:rPr>
+          <w:rFonts w:ascii="Consolas" w:cs="Consolas" w:eastAsia="Consolas" w:hAnsi="Consolas"/>
+          <w:sz w:val="19"/>
+          <w:szCs w:val="19"/>
+        </w:rPr>
+        <w:t xml:space="preserve">docs/PAPER_GUIDE.md</w:t>
+      </w:r>
+      <w:r>
+        <w:rPr>
+          <w:rFonts w:ascii="Times New Roman" w:cs="Times New Roman" w:eastAsia="Times New Roman" w:hAnsi="Times New Roman"/>
+          <w:sz w:val="21"/>
+          <w:szCs w:val="21"/>
+        </w:rPr>
+        <w:t xml:space="preserve">. All numbers come from generated result files; none are typed by hand. Results tables: </w:t>
       </w:r>
       <w:r>
         <w:rPr>
@@ -1012,7 +1028,7 @@
         <w:rPr>
           <w:rFonts w:ascii="Times New Roman" w:cs="Times New Roman" w:eastAsia="Times New Roman" w:hAnsi="Times New Roman"/>
         </w:rPr>
-        <w:t xml:space="preserve"> a stratified sample of occupations across skill levels and divisions is coded independently by human coders with the same rubric; agreement with the LLM is compared with agreement between humans (weighted κ, Krippendorff's α). </w:t>
+        <w:t xml:space="preserve"> three coders independently code a sample of 200 occupations with the same rubric and form questions as the LLM, blind to the LLM scores and to each other. The sample is stratified by occupational division and by whether the description names any digital term; occupations that do (about 6% of the corpus) are oversampled (70 of 200) so that the scores vary, and the 50 pilot occupations used to develop the prompt are excluded. Agreement statistics are reported unweighted and weighted by inverse inclusion probabilities. Agreement between each coder and the LLM is compared with agreement between coders (quadratic-weighted κ, Krippendorff's α); the LLM performs at human level if adding it as a rater does not lower α. </w:t>
       </w:r>
       <w:r>
         <w:rPr>

</xml_diff>

<commit_message>
Add RESULTS.md with every result so far and bring all docs up to date
docs/RESULTS.md (generated by paper/results_doc.py from reports/ and
data/processed/): project summary, timeline, RQ1 pilot/full run/second
model/human-validation checks, RQ3 ladder and robustness with Qwen, Llama
and O*NET DTI, RQ4 distribution, groups, interactions, Oaxaca, DoubleML
and the learner comparison, data checks, reviewer risks, pending items
and a file map. README, HANDOFF, SHAVAK (what actually ran, rates, the
/tmp lesson), PAPER_GUIDE, decisions and the draft's co-author note now
reflect the 21 Oct state; Word draft rebuilt.

Co-Authored-By: Claude Opus 5.5 <noreply@anthropic.com>
Claude-Session: https://claude.ai/code/session_016eFvPUAXSyAK1LFzUDMtag
</commit_message>
<xml_diff>
--- a/paper/DTI_paper_draft.docx
+++ b/paper/DTI_paper_draft.docx
@@ -46,7 +46,7 @@
           <w:sz w:val="21"/>
           <w:szCs w:val="21"/>
         </w:rPr>
-        <w:t xml:space="preserve">Note for co-authors (status on 20 October 2026).</w:t>
+        <w:t xml:space="preserve">Note for co-authors (status on 21 October 2026).</w:t>
       </w:r>
       <w:r>
         <w:rPr>
@@ -54,7 +54,7 @@
           <w:sz w:val="21"/>
           <w:szCs w:val="21"/>
         </w:rPr>
-        <w:t xml:space="preserve"> This draft follows the submitted extended abstract section by section (title, RQ1–RQ4, method, interpretation). Sections 1–5 (introduction, literature, data, index construction, empirical strategy) are complete. Section 6 reports what is available now: (i) the pilot of the LLM instrument (RQ1), and (ii) the full PLFS wage analysis estimated with the </w:t>
+        <w:t xml:space="preserve"> This draft follows the submitted extended abstract section by section. Sections 1–5 are complete. Section 6 still reports the pilot (6.1) and the wage analysis with the </w:t>
       </w:r>
       <w:r>
         <w:rPr>
@@ -72,7 +72,57 @@
           <w:sz w:val="21"/>
           <w:szCs w:val="21"/>
         </w:rPr>
-        <w:t xml:space="preserve"> digital-intensity measure, which the abstract uses as the benchmark (RQ3–RQ4, marked PRELIMINARY). The full LLM scoring of all 3,450 NCO occupations is running on PARAM Shavak and is expected to finish on 22 October; the same pipeline will then fill the parts marked </w:t>
+        <w:t xml:space="preserve"> measure (6.3–6.4, marked PRELIMINARY). </w:t>
+      </w:r>
+      <w:r>
+        <w:rPr>
+          <w:rFonts w:ascii="Times New Roman" w:cs="Times New Roman" w:eastAsia="Times New Roman" w:hAnsi="Times New Roman"/>
+          <w:b/>
+          <w:bCs/>
+          <w:sz w:val="21"/>
+          <w:szCs w:val="21"/>
+        </w:rPr>
+        <w:t xml:space="preserve">New since 20 October and not yet written into Section 6:</w:t>
+      </w:r>
+      <w:r>
+        <w:rPr>
+          <w:rFonts w:ascii="Times New Roman" w:cs="Times New Roman" w:eastAsia="Times New Roman" w:hAnsi="Times New Roman"/>
+          <w:sz w:val="21"/>
+          <w:szCs w:val="21"/>
+        </w:rPr>
+        <w:t xml:space="preserve"> the full LLM scoring of all 3,450 occupations with both models, run stability and cross-model agreement, the wage analysis with the NCO-LLM DTI (preferred estimate 4.1 log points, SE 1.3), the second-model robustness and the comparison of four machine-learning learners. All of it, with tables and interpretation, is in </w:t>
+      </w:r>
+      <w:r>
+        <w:rPr>
+          <w:rFonts w:ascii="Consolas" w:cs="Consolas" w:eastAsia="Consolas" w:hAnsi="Consolas"/>
+          <w:sz w:val="19"/>
+          <w:szCs w:val="19"/>
+        </w:rPr>
+        <w:t xml:space="preserve">docs/RESULTS.md</w:t>
+      </w:r>
+      <w:r>
+        <w:rPr>
+          <w:rFonts w:ascii="Times New Roman" w:cs="Times New Roman" w:eastAsia="Times New Roman" w:hAnsi="Times New Roman"/>
+          <w:sz w:val="21"/>
+          <w:szCs w:val="21"/>
+        </w:rPr>
+        <w:t xml:space="preserve">; the generated tables are in </w:t>
+      </w:r>
+      <w:r>
+        <w:rPr>
+          <w:rFonts w:ascii="Consolas" w:cs="Consolas" w:eastAsia="Consolas" w:hAnsi="Consolas"/>
+          <w:sz w:val="19"/>
+          <w:szCs w:val="19"/>
+        </w:rPr>
+        <w:t xml:space="preserve">paper/tables_llm.md</w:t>
+      </w:r>
+      <w:r>
+        <w:rPr>
+          <w:rFonts w:ascii="Times New Roman" w:cs="Times New Roman" w:eastAsia="Times New Roman" w:hAnsi="Times New Roman"/>
+          <w:sz w:val="21"/>
+          <w:szCs w:val="21"/>
+        </w:rPr>
+        <w:t xml:space="preserve">. RQ2 (same prompt on O*NET texts) finishes on 22 October. Human validation (</w:t>
       </w:r>
       <w:r>
         <w:rPr>
@@ -83,7 +133,7 @@
           <w:szCs w:val="21"/>
           <w:highlight w:val="yellow"/>
         </w:rPr>
-        <w:t xml:space="preserve">[PENDING-LLM]</w:t>
+        <w:t xml:space="preserve">[PENDING-HUMAN]</w:t>
       </w:r>
       <w:r>
         <w:rPr>
@@ -91,26 +141,7 @@
           <w:sz w:val="21"/>
           <w:szCs w:val="21"/>
         </w:rPr>
-        <w:t xml:space="preserve"> and add the NCO-LLM column next to every O*NET result. Human validation (</w:t>
-      </w:r>
-      <w:r>
-        <w:rPr>
-          <w:rFonts w:ascii="Times New Roman" w:cs="Times New Roman" w:eastAsia="Times New Roman" w:hAnsi="Times New Roman"/>
-          <w:b/>
-          <w:bCs/>
-          <w:sz w:val="21"/>
-          <w:szCs w:val="21"/>
-          <w:highlight w:val="yellow"/>
-        </w:rPr>
-        <w:t xml:space="preserve">[PENDING-HUMAN]</w:t>
-      </w:r>
-      <w:r>
-        <w:rPr>
-          <w:rFonts w:ascii="Times New Roman" w:cs="Times New Roman" w:eastAsia="Times New Roman" w:hAnsi="Times New Roman"/>
-          <w:sz w:val="21"/>
-          <w:szCs w:val="21"/>
-        </w:rPr>
-        <w:t xml:space="preserve">): the three forms received first were not usable (identical scores on all five dimensions for every occupation), so a new round on a stratified sample of 200 occupations went to three coders on 20 October, due 21 October. A writing guide for co-authors (what is final, what is pending, which file each number comes from) is in </w:t>
+        <w:t xml:space="preserve">): two rounds of coder forms were not usable (see </w:t>
       </w:r>
       <w:r>
         <w:rPr>
@@ -118,7 +149,7 @@
           <w:sz w:val="19"/>
           <w:szCs w:val="19"/>
         </w:rPr>
-        <w:t xml:space="preserve">docs/PAPER_GUIDE.md</w:t>
+        <w:t xml:space="preserve">docs/RESULTS.md</w:t>
       </w:r>
       <w:r>
         <w:rPr>
@@ -126,7 +157,7 @@
           <w:sz w:val="21"/>
           <w:szCs w:val="21"/>
         </w:rPr>
-        <w:t xml:space="preserve">. All numbers come from generated result files; none are typed by hand. Results tables: </w:t>
+        <w:t xml:space="preserve">, 3.5). Writing guide: </w:t>
       </w:r>
       <w:r>
         <w:rPr>
@@ -134,23 +165,7 @@
           <w:sz w:val="19"/>
           <w:szCs w:val="19"/>
         </w:rPr>
-        <w:t xml:space="preserve">paper/tables_onet.md</w:t>
-      </w:r>
-      <w:r>
-        <w:rPr>
-          <w:rFonts w:ascii="Times New Roman" w:cs="Times New Roman" w:eastAsia="Times New Roman" w:hAnsi="Times New Roman"/>
-          <w:sz w:val="21"/>
-          <w:szCs w:val="21"/>
-        </w:rPr>
-        <w:t xml:space="preserve">; code and logs: private repository </w:t>
-      </w:r>
-      <w:r>
-        <w:rPr>
-          <w:rFonts w:ascii="Consolas" w:cs="Consolas" w:eastAsia="Consolas" w:hAnsi="Consolas"/>
-          <w:sz w:val="19"/>
-          <w:szCs w:val="19"/>
-        </w:rPr>
-        <w:t xml:space="preserve">dti-india</w:t>
+        <w:t xml:space="preserve">docs/PAPER_GUIDE.md</w:t>
       </w:r>
       <w:r>
         <w:rPr>
@@ -17152,6 +17167,18 @@
       <w:pPr>
         <w:spacing w:after="80"/>
       </w:pPr>
+    </w:p>
+    <w:p>
+      <w:pPr>
+        <w:spacing w:after="120" w:line="288"/>
+        <w:jc w:val="both"/>
+      </w:pPr>
+      <w:r>
+        <w:rPr>
+          <w:rFonts w:ascii="Times New Roman" w:cs="Times New Roman" w:eastAsia="Times New Roman" w:hAnsi="Times New Roman"/>
+        </w:rPr>
+        <w:t xml:space="preserve">Standard errors in this table treat workers as independent; Table 11 gives the average effect with standard errors clustered by occupation.</w:t>
+      </w:r>
     </w:p>
     <w:p>
       <w:pPr>

</xml_diff>